<commit_message>
docs(expedientes): dejar Barcelona y Valencia listos para enviar (TRL 5)
Alinea la madurez a TRL 5 sin cifras inventadas de preflight, sustituye la demo publica por demostracion bajo peticion y regenera los cinco DOCX sin marcadores pendientes.

Co-authored-by: Cursor <cursoragent@cursor.com>
</commit_message>
<xml_diff>
--- a/docs/ayuntamiento-espais-experimentacio/declaracions/Declaracions_responsables_PulsePath.docx
+++ b/docs/ayuntamiento-espais-experimentacio/declaracions/Declaracions_responsables_PulsePath.docx
@@ -27,7 +27,7 @@
         <w:rPr>
           <w:i/>
         </w:rPr>
-        <w:t>Aquest document recull les sis declaracions responsables exigides per l'article 10.3.b. Cada declaració es pot presentar també com a document independent i signat per separat. Els camps entre claus dobles s'han d'emplenar abans de la signatura.</w:t>
+        <w:t>Aquest document recull les sis declaracions responsables exigides per l'article 10.3.b. Cada declaració es pot presentar també com a document independent. Cal emplenar a mà les dades personals del declarant i signar abans de presentar.</w:t>
       </w:r>
     </w:p>
     <w:p>
@@ -159,7 +159,7 @@
           <w:p>
             <w:r/>
             <w:r>
-              <w:t>{{NOM_COMPLET}}</w:t>
+              <w:t>______________________</w:t>
             </w:r>
           </w:p>
         </w:tc>
@@ -183,7 +183,7 @@
           <w:p>
             <w:r/>
             <w:r>
-              <w:t>{{NIF}}</w:t>
+              <w:t>______________________</w:t>
             </w:r>
           </w:p>
         </w:tc>
@@ -231,7 +231,7 @@
           <w:p>
             <w:r/>
             <w:r>
-              <w:t>{{DOMICILI}}</w:t>
+              <w:t>______________________</w:t>
             </w:r>
           </w:p>
         </w:tc>
@@ -255,7 +255,7 @@
           <w:p>
             <w:r/>
             <w:r>
-              <w:t>{{EMAIL}}</w:t>
+              <w:t>______________________</w:t>
             </w:r>
           </w:p>
         </w:tc>
@@ -279,7 +279,7 @@
           <w:p>
             <w:r/>
             <w:r>
-              <w:t>{{TELEFON}}</w:t>
+              <w:t>______________________</w:t>
             </w:r>
           </w:p>
         </w:tc>
@@ -407,7 +407,7 @@
     </w:p>
     <w:p>
       <w:r>
-        <w:t>A {{LLOC}}, el {{DATA_DECLARACIO}}.</w:t>
+        <w:t>A Barcelona, el ______________________.</w:t>
       </w:r>
     </w:p>
     <w:p>
@@ -422,7 +422,7 @@
     </w:p>
     <w:p>
       <w:r>
-        <w:t>{{NOM_COMPLET}}</w:t>
+        <w:t>Nom i cognoms: ______________________</w:t>
       </w:r>
     </w:p>
     <w:p/>
@@ -555,7 +555,7 @@
           <w:p>
             <w:r/>
             <w:r>
-              <w:t>{{NOM_COMPLET}}</w:t>
+              <w:t>______________________</w:t>
             </w:r>
           </w:p>
         </w:tc>
@@ -579,7 +579,7 @@
           <w:p>
             <w:r/>
             <w:r>
-              <w:t>{{NIF}}</w:t>
+              <w:t>______________________</w:t>
             </w:r>
           </w:p>
         </w:tc>
@@ -627,7 +627,7 @@
           <w:p>
             <w:r/>
             <w:r>
-              <w:t>{{DOMICILI}}</w:t>
+              <w:t>______________________</w:t>
             </w:r>
           </w:p>
         </w:tc>
@@ -651,7 +651,7 @@
           <w:p>
             <w:r/>
             <w:r>
-              <w:t>{{EMAIL}}</w:t>
+              <w:t>______________________</w:t>
             </w:r>
           </w:p>
         </w:tc>
@@ -675,7 +675,7 @@
           <w:p>
             <w:r/>
             <w:r>
-              <w:t>{{TELEFON}}</w:t>
+              <w:t>______________________</w:t>
             </w:r>
           </w:p>
         </w:tc>
@@ -778,7 +778,7 @@
     </w:p>
     <w:p>
       <w:r>
-        <w:t>A {{LLOC}}, el {{DATA_DECLARACIO}}.</w:t>
+        <w:t>A Barcelona, el ______________________.</w:t>
       </w:r>
     </w:p>
     <w:p>
@@ -793,7 +793,7 @@
     </w:p>
     <w:p>
       <w:r>
-        <w:t>{{NOM_COMPLET}}</w:t>
+        <w:t>Nom i cognoms: ______________________</w:t>
       </w:r>
     </w:p>
     <w:p/>
@@ -926,7 +926,7 @@
           <w:p>
             <w:r/>
             <w:r>
-              <w:t>{{NOM_COMPLET}}</w:t>
+              <w:t>______________________</w:t>
             </w:r>
           </w:p>
         </w:tc>
@@ -950,7 +950,7 @@
           <w:p>
             <w:r/>
             <w:r>
-              <w:t>{{NIF}}</w:t>
+              <w:t>______________________</w:t>
             </w:r>
           </w:p>
         </w:tc>
@@ -998,7 +998,7 @@
           <w:p>
             <w:r/>
             <w:r>
-              <w:t>{{DOMICILI}}</w:t>
+              <w:t>______________________</w:t>
             </w:r>
           </w:p>
         </w:tc>
@@ -1022,7 +1022,7 @@
           <w:p>
             <w:r/>
             <w:r>
-              <w:t>{{EMAIL}}</w:t>
+              <w:t>______________________</w:t>
             </w:r>
           </w:p>
         </w:tc>
@@ -1046,7 +1046,7 @@
           <w:p>
             <w:r/>
             <w:r>
-              <w:t>{{TELEFON}}</w:t>
+              <w:t>______________________</w:t>
             </w:r>
           </w:p>
         </w:tc>
@@ -1156,7 +1156,7 @@
     </w:p>
     <w:p>
       <w:r>
-        <w:t>A {{LLOC}}, el {{DATA_DECLARACIO}}.</w:t>
+        <w:t>A Barcelona, el ______________________.</w:t>
       </w:r>
     </w:p>
     <w:p>
@@ -1171,7 +1171,7 @@
     </w:p>
     <w:p>
       <w:r>
-        <w:t>{{NOM_COMPLET}}</w:t>
+        <w:t>Nom i cognoms: ______________________</w:t>
       </w:r>
     </w:p>
     <w:p/>
@@ -1304,7 +1304,7 @@
           <w:p>
             <w:r/>
             <w:r>
-              <w:t>{{NOM_COMPLET}}</w:t>
+              <w:t>______________________</w:t>
             </w:r>
           </w:p>
         </w:tc>
@@ -1328,7 +1328,7 @@
           <w:p>
             <w:r/>
             <w:r>
-              <w:t>{{NIF}}</w:t>
+              <w:t>______________________</w:t>
             </w:r>
           </w:p>
         </w:tc>
@@ -1376,7 +1376,7 @@
           <w:p>
             <w:r/>
             <w:r>
-              <w:t>{{DOMICILI}}</w:t>
+              <w:t>______________________</w:t>
             </w:r>
           </w:p>
         </w:tc>
@@ -1400,7 +1400,7 @@
           <w:p>
             <w:r/>
             <w:r>
-              <w:t>{{EMAIL}}</w:t>
+              <w:t>______________________</w:t>
             </w:r>
           </w:p>
         </w:tc>
@@ -1424,7 +1424,7 @@
           <w:p>
             <w:r/>
             <w:r>
-              <w:t>{{TELEFON}}</w:t>
+              <w:t>______________________</w:t>
             </w:r>
           </w:p>
         </w:tc>
@@ -1526,7 +1526,7 @@
     </w:p>
     <w:p>
       <w:r>
-        <w:t>A {{LLOC}}, el {{DATA_DECLARACIO}}.</w:t>
+        <w:t>A Barcelona, el ______________________.</w:t>
       </w:r>
     </w:p>
     <w:p>
@@ -1541,7 +1541,7 @@
     </w:p>
     <w:p>
       <w:r>
-        <w:t>{{NOM_COMPLET}}</w:t>
+        <w:t>Nom i cognoms: ______________________</w:t>
       </w:r>
     </w:p>
     <w:p/>
@@ -1674,7 +1674,7 @@
           <w:p>
             <w:r/>
             <w:r>
-              <w:t>{{NOM_COMPLET}}</w:t>
+              <w:t>______________________</w:t>
             </w:r>
           </w:p>
         </w:tc>
@@ -1698,7 +1698,7 @@
           <w:p>
             <w:r/>
             <w:r>
-              <w:t>{{NIF}}</w:t>
+              <w:t>______________________</w:t>
             </w:r>
           </w:p>
         </w:tc>
@@ -1746,7 +1746,7 @@
           <w:p>
             <w:r/>
             <w:r>
-              <w:t>{{DOMICILI}}</w:t>
+              <w:t>______________________</w:t>
             </w:r>
           </w:p>
         </w:tc>
@@ -1770,7 +1770,7 @@
           <w:p>
             <w:r/>
             <w:r>
-              <w:t>{{EMAIL}}</w:t>
+              <w:t>______________________</w:t>
             </w:r>
           </w:p>
         </w:tc>
@@ -1794,7 +1794,7 @@
           <w:p>
             <w:r/>
             <w:r>
-              <w:t>{{TELEFON}}</w:t>
+              <w:t>______________________</w:t>
             </w:r>
           </w:p>
         </w:tc>
@@ -1879,15 +1879,12 @@
       </w:r>
       <w:r>
         <w:rPr>
-          <w:rFonts w:ascii="Consolas" w:hAnsi="Consolas"/>
           <w:b/>
-          <w:color w:val="B14B00"/>
-          <w:sz w:val="19"/>
         </w:rPr>
-        <w:t>{{TOPALL_COSTOS_MUNICIPALS_EUR}}</w:t>
+        <w:t>1.000 €</w:t>
       </w:r>
       <w:r>
-        <w:t xml:space="preserve"> euros), i reconeix que aquest límit no minorarà la responsabilitat davant de terceres persones.</w:t>
+        <w:t>), i reconeix que aquest límit no minorarà la responsabilitat davant de terceres persones.</w:t>
       </w:r>
     </w:p>
     <w:p>
@@ -1924,7 +1921,7 @@
     </w:p>
     <w:p>
       <w:r>
-        <w:t>A {{LLOC}}, el {{DATA_DECLARACIO}}.</w:t>
+        <w:t>A Barcelona, el ______________________.</w:t>
       </w:r>
     </w:p>
     <w:p>
@@ -1939,7 +1936,7 @@
     </w:p>
     <w:p>
       <w:r>
-        <w:t>{{NOM_COMPLET}}</w:t>
+        <w:t>Nom i cognoms: ______________________</w:t>
       </w:r>
     </w:p>
     <w:p/>
@@ -2081,7 +2078,7 @@
           <w:p>
             <w:r/>
             <w:r>
-              <w:t>{{NOM_COMPLET}}</w:t>
+              <w:t>______________________</w:t>
             </w:r>
           </w:p>
         </w:tc>
@@ -2105,7 +2102,7 @@
           <w:p>
             <w:r/>
             <w:r>
-              <w:t>{{NIF}}</w:t>
+              <w:t>______________________</w:t>
             </w:r>
           </w:p>
         </w:tc>
@@ -2153,7 +2150,7 @@
           <w:p>
             <w:r/>
             <w:r>
-              <w:t>{{DOMICILI}}</w:t>
+              <w:t>______________________</w:t>
             </w:r>
           </w:p>
         </w:tc>
@@ -2177,7 +2174,7 @@
           <w:p>
             <w:r/>
             <w:r>
-              <w:t>{{EMAIL}}</w:t>
+              <w:t>______________________</w:t>
             </w:r>
           </w:p>
         </w:tc>
@@ -2201,7 +2198,7 @@
           <w:p>
             <w:r/>
             <w:r>
-              <w:t>{{TELEFON}}</w:t>
+              <w:t>______________________</w:t>
             </w:r>
           </w:p>
         </w:tc>
@@ -2523,7 +2520,7 @@
     </w:p>
     <w:p>
       <w:r>
-        <w:t>A {{LLOC}}, el {{DATA_DECLARACIO}}.</w:t>
+        <w:t>A Barcelona, el ______________________.</w:t>
       </w:r>
     </w:p>
     <w:p>
@@ -2538,7 +2535,7 @@
     </w:p>
     <w:p>
       <w:r>
-        <w:t>{{NOM_COMPLET}}</w:t>
+        <w:t>Nom i cognoms: ______________________</w:t>
       </w:r>
     </w:p>
     <w:sectPr>

</xml_diff>